<commit_message>
Add Macrae et al. 2026
</commit_message>
<xml_diff>
--- a/_site/cv/cv.docx
+++ b/_site/cv/cv.docx
@@ -149,7 +149,7 @@
       </w:r>
     </w:p>
     <w:bookmarkEnd w:id="24"/>
-    <w:bookmarkStart w:id="58" w:name="publications"/>
+    <w:bookmarkStart w:id="60" w:name="publications"/>
     <w:p>
       <w:pPr>
         <w:pStyle w:val="Heading2"/>
@@ -158,14 +158,14 @@
         <w:t xml:space="preserve">Publications</w:t>
       </w:r>
     </w:p>
-    <w:bookmarkStart w:id="57" w:name="refs-pub"/>
-    <w:bookmarkStart w:id="26" w:name="ref-sheardExploringSocialMeaning2026"/>
+    <w:bookmarkStart w:id="59" w:name="refs-pub"/>
+    <w:bookmarkStart w:id="26" w:name="ref-macraePredictingSpeechSound"/>
     <w:p>
       <w:pPr>
         <w:pStyle w:val="FirstParagraph"/>
       </w:pPr>
       <w:r>
-        <w:t xml:space="preserve">Sheard, Elena, Jennifer Hay, Robert Fromont,</w:t>
+        <w:t xml:space="preserve">Macrae, Toby, Hamimah Ahmat, Jayne Newbury, Jiajie Chen, Michaela Frengley, Laura Strevens, Kate Tyson, and</w:t>
       </w:r>
       <w:r>
         <w:t xml:space="preserve"> </w:t>
@@ -195,37 +195,61 @@
           <w:b/>
           <w:bCs/>
         </w:rPr>
-        <w:t xml:space="preserve">Black,</w:t>
-      </w:r>
-      <w:r>
-        <w:t xml:space="preserve"> </w:t>
-      </w:r>
-      <w:r>
-        <w:t xml:space="preserve">and Lynn Clark. 2026.</w:t>
-      </w:r>
-      <w:r>
-        <w:t xml:space="preserve"> </w:t>
-      </w:r>
-      <w:r>
-        <w:t xml:space="preserve">“Exploring the Social Meaning of the</w:t>
-      </w:r>
-      <w:r>
-        <w:t xml:space="preserve"> </w:t>
-      </w:r>
-      <w:r>
-        <w:t xml:space="preserve">‘Leader-Lagger’</w:t>
-      </w:r>
-      <w:r>
-        <w:t xml:space="preserve"> </w:t>
-      </w:r>
-      <w:r>
-        <w:t xml:space="preserve">Vowels in</w:t>
-      </w:r>
-      <w:r>
-        <w:t xml:space="preserve"> </w:t>
-      </w:r>
-      <w:r>
-        <w:t xml:space="preserve">New Zealand English</w:t>
+        <w:t xml:space="preserve">Black.</w:t>
+      </w:r>
+      <w:r>
+        <w:t xml:space="preserve"> </w:t>
+      </w:r>
+      <w:r>
+        <w:t xml:space="preserve">2026.</w:t>
+      </w:r>
+      <w:r>
+        <w:t xml:space="preserve"> </w:t>
+      </w:r>
+      <w:r>
+        <w:t xml:space="preserve">“Predicting</w:t>
+      </w:r>
+      <w:r>
+        <w:t xml:space="preserve"> </w:t>
+      </w:r>
+      <w:r>
+        <w:t xml:space="preserve">Speech Sound Production</w:t>
+      </w:r>
+      <w:r>
+        <w:t xml:space="preserve"> </w:t>
+      </w:r>
+      <w:r>
+        <w:t xml:space="preserve">and</w:t>
+      </w:r>
+      <w:r>
+        <w:t xml:space="preserve"> </w:t>
+      </w:r>
+      <w:r>
+        <w:t xml:space="preserve">Phonological Awareness Outcomes</w:t>
+      </w:r>
+      <w:r>
+        <w:t xml:space="preserve"> </w:t>
+      </w:r>
+      <w:r>
+        <w:t xml:space="preserve">in</w:t>
+      </w:r>
+      <w:r>
+        <w:t xml:space="preserve"> </w:t>
+      </w:r>
+      <w:r>
+        <w:t xml:space="preserve">Late-Talking</w:t>
+      </w:r>
+      <w:r>
+        <w:t xml:space="preserve"> </w:t>
+      </w:r>
+      <w:r>
+        <w:t xml:space="preserve">and</w:t>
+      </w:r>
+      <w:r>
+        <w:t xml:space="preserve"> </w:t>
+      </w:r>
+      <w:r>
+        <w:t xml:space="preserve">Typically Developing Preschool Children Using Early Phonological Pattern Use</w:t>
       </w:r>
       <w:r>
         <w:t xml:space="preserve">.”</w:t>
@@ -238,6 +262,103 @@
           <w:i/>
           <w:iCs/>
         </w:rPr>
+        <w:t xml:space="preserve">Journal of Speech, Language, and Hearing Research</w:t>
+      </w:r>
+      <w:r>
+        <w:t xml:space="preserve">, June. doi:</w:t>
+      </w:r>
+      <w:hyperlink r:id="rId25">
+        <w:r>
+          <w:rPr>
+            <w:rStyle w:val="Hyperlink"/>
+          </w:rPr>
+          <w:t xml:space="preserve">10.1044/2026_JSLHR-25-00805</w:t>
+        </w:r>
+      </w:hyperlink>
+      <w:r>
+        <w:t xml:space="preserve">.</w:t>
+      </w:r>
+    </w:p>
+    <w:bookmarkEnd w:id="26"/>
+    <w:bookmarkStart w:id="28" w:name="ref-sheardExploringSocialMeaning2026"/>
+    <w:p>
+      <w:pPr>
+        <w:pStyle w:val="BodyText"/>
+      </w:pPr>
+      <w:r>
+        <w:t xml:space="preserve">Sheard, Elena, Jennifer Hay, Robert Fromont,</w:t>
+      </w:r>
+      <w:r>
+        <w:t xml:space="preserve"> </w:t>
+      </w:r>
+      <w:r>
+        <w:rPr>
+          <w:b/>
+          <w:bCs/>
+        </w:rPr>
+        <w:t xml:space="preserve">Joshua</w:t>
+      </w:r>
+      <w:r>
+        <w:t xml:space="preserve"> </w:t>
+      </w:r>
+      <w:r>
+        <w:rPr>
+          <w:b/>
+          <w:bCs/>
+        </w:rPr>
+        <w:t xml:space="preserve">Wilson</w:t>
+      </w:r>
+      <w:r>
+        <w:t xml:space="preserve"> </w:t>
+      </w:r>
+      <w:r>
+        <w:rPr>
+          <w:b/>
+          <w:bCs/>
+        </w:rPr>
+        <w:t xml:space="preserve">Black,</w:t>
+      </w:r>
+      <w:r>
+        <w:t xml:space="preserve"> </w:t>
+      </w:r>
+      <w:r>
+        <w:t xml:space="preserve">and Lynn Clark. 2026.</w:t>
+      </w:r>
+      <w:r>
+        <w:t xml:space="preserve"> </w:t>
+      </w:r>
+      <w:r>
+        <w:t xml:space="preserve">“Exploring the Social Meaning of the</w:t>
+      </w:r>
+      <w:r>
+        <w:t xml:space="preserve"> </w:t>
+      </w:r>
+      <w:r>
+        <w:t xml:space="preserve">‘Leader-Lagger’</w:t>
+      </w:r>
+      <w:r>
+        <w:t xml:space="preserve"> </w:t>
+      </w:r>
+      <w:r>
+        <w:t xml:space="preserve">Vowels in</w:t>
+      </w:r>
+      <w:r>
+        <w:t xml:space="preserve"> </w:t>
+      </w:r>
+      <w:r>
+        <w:t xml:space="preserve">New Zealand English</w:t>
+      </w:r>
+      <w:r>
+        <w:t xml:space="preserve">.”</w:t>
+      </w:r>
+      <w:r>
+        <w:t xml:space="preserve"> </w:t>
+      </w:r>
+      <w:r>
+        <w:rPr>
+          <w:i/>
+          <w:iCs/>
+        </w:rPr>
         <w:t xml:space="preserve">Laboratory Phonology</w:t>
       </w:r>
       <w:r>
@@ -246,7 +367,7 @@
       <w:r>
         <w:t xml:space="preserve">17 (1). Open Library of Humanities. doi:</w:t>
       </w:r>
-      <w:hyperlink r:id="rId25">
+      <w:hyperlink r:id="rId27">
         <w:r>
           <w:rPr>
             <w:rStyle w:val="Hyperlink"/>
@@ -258,8 +379,8 @@
         <w:t xml:space="preserve">.</w:t>
       </w:r>
     </w:p>
-    <w:bookmarkEnd w:id="26"/>
-    <w:bookmarkStart w:id="28" w:name="ref-sheardLeadersChangeSound2025"/>
+    <w:bookmarkEnd w:id="28"/>
+    <w:bookmarkStart w:id="30" w:name="ref-sheardLeadersChangeSound2025"/>
     <w:p>
       <w:pPr>
         <w:pStyle w:val="BodyText"/>
@@ -370,7 +491,7 @@
       <w:r>
         <w:t xml:space="preserve">20 (12). Public Library of Science: e0338199. doi:</w:t>
       </w:r>
-      <w:hyperlink r:id="rId27">
+      <w:hyperlink r:id="rId29">
         <w:r>
           <w:rPr>
             <w:rStyle w:val="Hyperlink"/>
@@ -382,8 +503,8 @@
         <w:t xml:space="preserve">.</w:t>
       </w:r>
     </w:p>
-    <w:bookmarkEnd w:id="28"/>
-    <w:bookmarkStart w:id="30" w:name="ref-hurringHowStableAre2025"/>
+    <w:bookmarkEnd w:id="30"/>
+    <w:bookmarkStart w:id="32" w:name="ref-hurringHowStableAre2025"/>
     <w:p>
       <w:pPr>
         <w:pStyle w:val="BodyText"/>
@@ -446,7 +567,7 @@
       <w:r>
         <w:t xml:space="preserve">, May, 1–25. doi:</w:t>
       </w:r>
-      <w:hyperlink r:id="rId29">
+      <w:hyperlink r:id="rId31">
         <w:r>
           <w:rPr>
             <w:rStyle w:val="Hyperlink"/>
@@ -458,8 +579,8 @@
         <w:t xml:space="preserve">.</w:t>
       </w:r>
     </w:p>
-    <w:bookmarkEnd w:id="30"/>
-    <w:bookmarkStart w:id="32" w:name="ref-flegoChangingTrajectoriesNew2025"/>
+    <w:bookmarkEnd w:id="32"/>
+    <w:bookmarkStart w:id="34" w:name="ref-flegoChangingTrajectoriesNew2025"/>
     <w:p>
       <w:pPr>
         <w:pStyle w:val="BodyText"/>
@@ -537,7 +658,7 @@
       <w:r>
         <w:t xml:space="preserve">157 (April): A125. doi:</w:t>
       </w:r>
-      <w:hyperlink r:id="rId31">
+      <w:hyperlink r:id="rId33">
         <w:r>
           <w:rPr>
             <w:rStyle w:val="Hyperlink"/>
@@ -549,8 +670,8 @@
         <w:t xml:space="preserve">.</w:t>
       </w:r>
     </w:p>
-    <w:bookmarkEnd w:id="32"/>
-    <w:bookmarkStart w:id="34" w:name="X0de8222cc7537376974e88effeeb06f57514f7b"/>
+    <w:bookmarkEnd w:id="34"/>
+    <w:bookmarkStart w:id="36" w:name="X0de8222cc7537376974e88effeeb06f57514f7b"/>
     <w:p>
       <w:pPr>
         <w:pStyle w:val="BodyText"/>
@@ -676,7 +797,7 @@
       <w:r>
         <w:t xml:space="preserve"> </w:t>
       </w:r>
-      <w:hyperlink r:id="rId33">
+      <w:hyperlink r:id="rId35">
         <w:r>
           <w:rPr>
             <w:rStyle w:val="Hyperlink"/>
@@ -688,8 +809,8 @@
         <w:t xml:space="preserve">.</w:t>
       </w:r>
     </w:p>
-    <w:bookmarkEnd w:id="34"/>
-    <w:bookmarkStart w:id="36" w:name="X29acdd54cc7e973ba1e2b9f7bd66a177840b33c"/>
+    <w:bookmarkEnd w:id="36"/>
+    <w:bookmarkStart w:id="38" w:name="X29acdd54cc7e973ba1e2b9f7bd66a177840b33c"/>
     <w:p>
       <w:pPr>
         <w:pStyle w:val="BodyText"/>
@@ -751,7 +872,7 @@
       <w:r>
         <w:t xml:space="preserve"> </w:t>
       </w:r>
-      <w:hyperlink r:id="rId35">
+      <w:hyperlink r:id="rId37">
         <w:r>
           <w:rPr>
             <w:rStyle w:val="Hyperlink"/>
@@ -763,8 +884,8 @@
         <w:t xml:space="preserve">.</w:t>
       </w:r>
     </w:p>
-    <w:bookmarkEnd w:id="36"/>
-    <w:bookmarkStart w:id="38" w:name="ref-maclaganPronunciationWordMaori2024"/>
+    <w:bookmarkEnd w:id="38"/>
+    <w:bookmarkStart w:id="40" w:name="ref-maclaganPronunciationWordMaori2024"/>
     <w:p>
       <w:pPr>
         <w:pStyle w:val="BodyText"/>
@@ -848,7 +969,7 @@
       <w:r>
         <w:t xml:space="preserve"> </w:t>
       </w:r>
-      <w:hyperlink r:id="rId37">
+      <w:hyperlink r:id="rId39">
         <w:r>
           <w:rPr>
             <w:rStyle w:val="Hyperlink"/>
@@ -860,8 +981,8 @@
         <w:t xml:space="preserve">.</w:t>
       </w:r>
     </w:p>
-    <w:bookmarkEnd w:id="38"/>
-    <w:bookmarkStart w:id="40" w:name="ref-Wilson_Black_2023"/>
+    <w:bookmarkEnd w:id="40"/>
+    <w:bookmarkStart w:id="42" w:name="ref-Wilson_Black_2023"/>
     <w:p>
       <w:pPr>
         <w:pStyle w:val="BodyText"/>
@@ -921,7 +1042,7 @@
       <w:r>
         <w:t xml:space="preserve">9 (1). Walter de Gruyter GmbH: 173–89. doi:</w:t>
       </w:r>
-      <w:hyperlink r:id="rId39">
+      <w:hyperlink r:id="rId41">
         <w:r>
           <w:rPr>
             <w:rStyle w:val="Hyperlink"/>
@@ -933,8 +1054,8 @@
         <w:t xml:space="preserve">.</w:t>
       </w:r>
     </w:p>
-    <w:bookmarkEnd w:id="40"/>
-    <w:bookmarkStart w:id="42" w:name="ref-fromontMaximizingAccuracyForced2023a"/>
+    <w:bookmarkEnd w:id="42"/>
+    <w:bookmarkStart w:id="44" w:name="ref-fromontMaximizingAccuracyForced2023a"/>
     <w:p>
       <w:pPr>
         <w:pStyle w:val="BodyText"/>
@@ -1000,7 +1121,7 @@
       <w:r>
         <w:t xml:space="preserve">3 (1). doi:</w:t>
       </w:r>
-      <w:hyperlink r:id="rId41">
+      <w:hyperlink r:id="rId43">
         <w:r>
           <w:rPr>
             <w:rStyle w:val="Hyperlink"/>
@@ -1012,8 +1133,8 @@
         <w:t xml:space="preserve">.</w:t>
       </w:r>
     </w:p>
-    <w:bookmarkEnd w:id="42"/>
-    <w:bookmarkStart w:id="44" w:name="Xbad568822c389b1a95ed4465cfeb0e8e55be403"/>
+    <w:bookmarkEnd w:id="44"/>
+    <w:bookmarkStart w:id="46" w:name="Xbad568822c389b1a95ed4465cfeb0e8e55be403"/>
     <w:p>
       <w:pPr>
         <w:pStyle w:val="BodyText"/>
@@ -1183,7 +1304,7 @@
       <w:r>
         <w:t xml:space="preserve">, edited by Robert Talisse, Paniel Reyes Cárdenas, and Daniel Herbert. Routledge. doi:</w:t>
       </w:r>
-      <w:hyperlink r:id="rId43">
+      <w:hyperlink r:id="rId45">
         <w:r>
           <w:rPr>
             <w:rStyle w:val="Hyperlink"/>
@@ -1195,8 +1316,8 @@
         <w:t xml:space="preserve">.</w:t>
       </w:r>
     </w:p>
-    <w:bookmarkEnd w:id="44"/>
-    <w:bookmarkStart w:id="46" w:name="X69c15fe9ad089d036b56540472350eabf8b0b4c"/>
+    <w:bookmarkEnd w:id="46"/>
+    <w:bookmarkStart w:id="48" w:name="X69c15fe9ad089d036b56540472350eabf8b0b4c"/>
     <w:p>
       <w:pPr>
         <w:pStyle w:val="BodyText"/>
@@ -1226,7 +1347,7 @@
       <w:r>
         <w:t xml:space="preserve">38 (2). Oxford University Press (OUP): 779–97. doi:</w:t>
       </w:r>
-      <w:hyperlink r:id="rId45">
+      <w:hyperlink r:id="rId47">
         <w:r>
           <w:rPr>
             <w:rStyle w:val="Hyperlink"/>
@@ -1238,8 +1359,8 @@
         <w:t xml:space="preserve">.</w:t>
       </w:r>
     </w:p>
-    <w:bookmarkEnd w:id="46"/>
-    <w:bookmarkStart w:id="48" w:name="ref-Wilson_Black_2022"/>
+    <w:bookmarkEnd w:id="48"/>
+    <w:bookmarkStart w:id="50" w:name="ref-Wilson_Black_2022"/>
     <w:p>
       <w:pPr>
         <w:pStyle w:val="BodyText"/>
@@ -1299,7 +1420,7 @@
       <w:r>
         <w:t xml:space="preserve">17 (1). Wiley. doi:</w:t>
       </w:r>
-      <w:hyperlink r:id="rId47">
+      <w:hyperlink r:id="rId49">
         <w:r>
           <w:rPr>
             <w:rStyle w:val="Hyperlink"/>
@@ -1311,8 +1432,8 @@
         <w:t xml:space="preserve">.</w:t>
       </w:r>
     </w:p>
-    <w:bookmarkEnd w:id="48"/>
-    <w:bookmarkStart w:id="50" w:name="ref-leggWhatIntelligencePeircean2022"/>
+    <w:bookmarkEnd w:id="50"/>
+    <w:bookmarkStart w:id="52" w:name="ref-leggWhatIntelligencePeircean2022"/>
     <w:p>
       <w:pPr>
         <w:pStyle w:val="BodyText"/>
@@ -1394,7 +1515,7 @@
       <w:r>
         <w:t xml:space="preserve">87 (5). Dordrecht: Springer Netherlands: 2265–84. doi:</w:t>
       </w:r>
-      <w:hyperlink r:id="rId49">
+      <w:hyperlink r:id="rId51">
         <w:r>
           <w:rPr>
             <w:rStyle w:val="Hyperlink"/>
@@ -1406,8 +1527,8 @@
         <w:t xml:space="preserve">.</w:t>
       </w:r>
     </w:p>
-    <w:bookmarkEnd w:id="50"/>
-    <w:bookmarkStart w:id="52" w:name="ref-blackPeirceConceptionMetaphysics2017"/>
+    <w:bookmarkEnd w:id="52"/>
+    <w:bookmarkStart w:id="54" w:name="ref-blackPeirceConceptionMetaphysics2017"/>
     <w:p>
       <w:pPr>
         <w:pStyle w:val="BodyText"/>
@@ -1467,7 +1588,7 @@
       <w:r>
         <w:t xml:space="preserve"> </w:t>
       </w:r>
-      <w:hyperlink r:id="rId51">
+      <w:hyperlink r:id="rId53">
         <w:r>
           <w:rPr>
             <w:rStyle w:val="Hyperlink"/>
@@ -1479,8 +1600,8 @@
         <w:t xml:space="preserve">.</w:t>
       </w:r>
     </w:p>
-    <w:bookmarkEnd w:id="52"/>
-    <w:bookmarkStart w:id="54" w:name="ref-Black2016-BLAP-27"/>
+    <w:bookmarkEnd w:id="54"/>
+    <w:bookmarkStart w:id="56" w:name="ref-Black2016-BLAP-27"/>
     <w:p>
       <w:pPr>
         <w:pStyle w:val="BodyText"/>
@@ -1517,7 +1638,7 @@
       <w:r>
         <w:t xml:space="preserve">24 (6). Routledge: 1223–27. doi:</w:t>
       </w:r>
-      <w:hyperlink r:id="rId53">
+      <w:hyperlink r:id="rId55">
         <w:r>
           <w:rPr>
             <w:rStyle w:val="Hyperlink"/>
@@ -1529,8 +1650,8 @@
         <w:t xml:space="preserve">.</w:t>
       </w:r>
     </w:p>
-    <w:bookmarkEnd w:id="54"/>
-    <w:bookmarkStart w:id="56" w:name="ref-blackPeirceHabitPractice2013"/>
+    <w:bookmarkEnd w:id="56"/>
+    <w:bookmarkStart w:id="58" w:name="ref-blackPeirceHabitPractice2013"/>
     <w:p>
       <w:pPr>
         <w:pStyle w:val="BodyText"/>
@@ -1635,7 +1756,7 @@
       <w:r>
         <w:t xml:space="preserve"> </w:t>
       </w:r>
-      <w:hyperlink r:id="rId55">
+      <w:hyperlink r:id="rId57">
         <w:r>
           <w:rPr>
             <w:rStyle w:val="Hyperlink"/>
@@ -1647,10 +1768,10 @@
         <w:t xml:space="preserve">.</w:t>
       </w:r>
     </w:p>
-    <w:bookmarkEnd w:id="56"/>
-    <w:bookmarkEnd w:id="57"/>
     <w:bookmarkEnd w:id="58"/>
-    <w:bookmarkStart w:id="110" w:name="presentations"/>
+    <w:bookmarkEnd w:id="59"/>
+    <w:bookmarkEnd w:id="60"/>
+    <w:bookmarkStart w:id="112" w:name="presentations"/>
     <w:p>
       <w:pPr>
         <w:pStyle w:val="Heading2"/>
@@ -1659,8 +1780,8 @@
         <w:t xml:space="preserve">Presentations</w:t>
       </w:r>
     </w:p>
-    <w:bookmarkStart w:id="109" w:name="refs-pres"/>
-    <w:bookmarkStart w:id="59" w:name="X483d36f21c6df2478797c78698df785a6229240"/>
+    <w:bookmarkStart w:id="111" w:name="refs-pres"/>
+    <w:bookmarkStart w:id="61" w:name="X483d36f21c6df2478797c78698df785a6229240"/>
     <w:p>
       <w:pPr>
         <w:pStyle w:val="FirstParagraph"/>
@@ -1753,8 +1874,8 @@
         <w:t xml:space="preserve">, November 27.</w:t>
       </w:r>
     </w:p>
-    <w:bookmarkEnd w:id="59"/>
-    <w:bookmarkStart w:id="60" w:name="ref-sheardComparingPerceptionNew2024"/>
+    <w:bookmarkEnd w:id="61"/>
+    <w:bookmarkStart w:id="62" w:name="ref-sheardComparingPerceptionNew2024"/>
     <w:p>
       <w:pPr>
         <w:pStyle w:val="BodyText"/>
@@ -1835,8 +1956,8 @@
         <w:t xml:space="preserve">2024, University of Canterbury, December 9.</w:t>
       </w:r>
     </w:p>
-    <w:bookmarkEnd w:id="60"/>
-    <w:bookmarkStart w:id="62" w:name="ref-wilsonblackNzilbbvowelsNewTool2024"/>
+    <w:bookmarkEnd w:id="62"/>
+    <w:bookmarkStart w:id="64" w:name="ref-wilsonblackNzilbbvowelsNewTool2024"/>
     <w:p>
       <w:pPr>
         <w:pStyle w:val="BodyText"/>
@@ -1913,7 +2034,7 @@
       <w:r>
         <w:t xml:space="preserve"> </w:t>
       </w:r>
-      <w:hyperlink r:id="rId61">
+      <w:hyperlink r:id="rId63">
         <w:r>
           <w:rPr>
             <w:rStyle w:val="Hyperlink"/>
@@ -1925,8 +2046,8 @@
         <w:t xml:space="preserve">.</w:t>
       </w:r>
     </w:p>
-    <w:bookmarkEnd w:id="62"/>
-    <w:bookmarkStart w:id="63" w:name="ref-wilsonblackPCAVocalicCovariation2024"/>
+    <w:bookmarkEnd w:id="64"/>
+    <w:bookmarkStart w:id="65" w:name="ref-wilsonblackPCAVocalicCovariation2024"/>
     <w:p>
       <w:pPr>
         <w:pStyle w:val="BodyText"/>
@@ -2025,8 +2146,8 @@
         <w:t xml:space="preserve">, Australian National University, November 21.</w:t>
       </w:r>
     </w:p>
-    <w:bookmarkEnd w:id="63"/>
-    <w:bookmarkStart w:id="65" w:name="X1d618fcd4214560a60b820b87ccfe7ec510d93b"/>
+    <w:bookmarkEnd w:id="65"/>
+    <w:bookmarkStart w:id="67" w:name="X1d618fcd4214560a60b820b87ccfe7ec510d93b"/>
     <w:p>
       <w:pPr>
         <w:pStyle w:val="BodyText"/>
@@ -2118,7 +2239,7 @@
       <w:r>
         <w:t xml:space="preserve"> </w:t>
       </w:r>
-      <w:hyperlink r:id="rId64">
+      <w:hyperlink r:id="rId66">
         <w:r>
           <w:rPr>
             <w:rStyle w:val="Hyperlink"/>
@@ -2130,8 +2251,8 @@
         <w:t xml:space="preserve">.</w:t>
       </w:r>
     </w:p>
-    <w:bookmarkEnd w:id="65"/>
-    <w:bookmarkStart w:id="66" w:name="ref-sheardCovaryingNewZealand2024"/>
+    <w:bookmarkEnd w:id="67"/>
+    <w:bookmarkStart w:id="68" w:name="ref-sheardCovaryingNewZealand2024"/>
     <w:p>
       <w:pPr>
         <w:pStyle w:val="BodyText"/>
@@ -2221,8 +2342,8 @@
         <w:t xml:space="preserve">, Hanyang University, June 29.</w:t>
       </w:r>
     </w:p>
-    <w:bookmarkEnd w:id="66"/>
-    <w:bookmarkStart w:id="68" w:name="X4f287bbac3b1fbdb6f8815bafb43cf27984110b"/>
+    <w:bookmarkEnd w:id="68"/>
+    <w:bookmarkStart w:id="70" w:name="X4f287bbac3b1fbdb6f8815bafb43cf27984110b"/>
     <w:p>
       <w:pPr>
         <w:pStyle w:val="BodyText"/>
@@ -2284,7 +2405,7 @@
       <w:r>
         <w:t xml:space="preserve"> </w:t>
       </w:r>
-      <w:hyperlink r:id="rId67">
+      <w:hyperlink r:id="rId69">
         <w:r>
           <w:rPr>
             <w:rStyle w:val="Hyperlink"/>
@@ -2296,8 +2417,8 @@
         <w:t xml:space="preserve">.</w:t>
       </w:r>
     </w:p>
-    <w:bookmarkEnd w:id="68"/>
-    <w:bookmarkStart w:id="70" w:name="ref-wilsonblackPhilosophy19thCentury2023"/>
+    <w:bookmarkEnd w:id="70"/>
+    <w:bookmarkStart w:id="72" w:name="ref-wilsonblackPhilosophy19thCentury2023"/>
     <w:p>
       <w:pPr>
         <w:pStyle w:val="BodyText"/>
@@ -2371,7 +2492,7 @@
       <w:r>
         <w:t xml:space="preserve"> </w:t>
       </w:r>
-      <w:hyperlink r:id="rId69">
+      <w:hyperlink r:id="rId71">
         <w:r>
           <w:rPr>
             <w:rStyle w:val="Hyperlink"/>
@@ -2383,8 +2504,8 @@
         <w:t xml:space="preserve">.</w:t>
       </w:r>
     </w:p>
-    <w:bookmarkEnd w:id="70"/>
-    <w:bookmarkStart w:id="72" w:name="Xcf376ac1776d5aafe27ffcea51e7a59b799ea07"/>
+    <w:bookmarkEnd w:id="72"/>
+    <w:bookmarkStart w:id="74" w:name="Xcf376ac1776d5aafe27ffcea51e7a59b799ea07"/>
     <w:p>
       <w:pPr>
         <w:pStyle w:val="BodyText"/>
@@ -2437,7 +2558,7 @@
       <w:r>
         <w:t xml:space="preserve"> </w:t>
       </w:r>
-      <w:hyperlink r:id="rId71">
+      <w:hyperlink r:id="rId73">
         <w:r>
           <w:rPr>
             <w:rStyle w:val="Hyperlink"/>
@@ -2449,8 +2570,8 @@
         <w:t xml:space="preserve">.</w:t>
       </w:r>
     </w:p>
-    <w:bookmarkEnd w:id="72"/>
-    <w:bookmarkStart w:id="73" w:name="ref-wilsonblackEarlyAcquisitionNew2023"/>
+    <w:bookmarkEnd w:id="74"/>
+    <w:bookmarkStart w:id="75" w:name="ref-wilsonblackEarlyAcquisitionNew2023"/>
     <w:p>
       <w:pPr>
         <w:pStyle w:val="BodyText"/>
@@ -2534,8 +2655,8 @@
         <w:t xml:space="preserve">, University of Auckland, November 30.</w:t>
       </w:r>
     </w:p>
-    <w:bookmarkEnd w:id="73"/>
-    <w:bookmarkStart w:id="75" w:name="Xf75268b32a3c8e136b56f36d27d9a2cefbc407e"/>
+    <w:bookmarkEnd w:id="75"/>
+    <w:bookmarkStart w:id="77" w:name="Xf75268b32a3c8e136b56f36d27d9a2cefbc407e"/>
     <w:p>
       <w:pPr>
         <w:pStyle w:val="BodyText"/>
@@ -2567,7 +2688,7 @@
       <w:r>
         <w:t xml:space="preserve"> </w:t>
       </w:r>
-      <w:hyperlink r:id="rId74">
+      <w:hyperlink r:id="rId76">
         <w:r>
           <w:rPr>
             <w:rStyle w:val="Hyperlink"/>
@@ -2579,8 +2700,8 @@
         <w:t xml:space="preserve">.</w:t>
       </w:r>
     </w:p>
-    <w:bookmarkEnd w:id="75"/>
-    <w:bookmarkStart w:id="76" w:name="Xa01cfb479560f22d852adc7a584ab5636351479"/>
+    <w:bookmarkEnd w:id="77"/>
+    <w:bookmarkStart w:id="78" w:name="Xa01cfb479560f22d852adc7a584ab5636351479"/>
     <w:p>
       <w:pPr>
         <w:pStyle w:val="BodyText"/>
@@ -2655,8 +2776,8 @@
         <w:t xml:space="preserve">, University of Auckland, November 29.</w:t>
       </w:r>
     </w:p>
-    <w:bookmarkEnd w:id="76"/>
-    <w:bookmarkStart w:id="77" w:name="ref-sheardChangeLifespanCovarying2023b"/>
+    <w:bookmarkEnd w:id="78"/>
+    <w:bookmarkStart w:id="79" w:name="ref-sheardChangeLifespanCovarying2023b"/>
     <w:p>
       <w:pPr>
         <w:pStyle w:val="BodyText"/>
@@ -2734,8 +2855,8 @@
         <w:t xml:space="preserve">, University of Sydney, November.</w:t>
       </w:r>
     </w:p>
-    <w:bookmarkEnd w:id="77"/>
-    <w:bookmarkStart w:id="78" w:name="X35fe791bde2b24538a71000ea7a80b48c78f998"/>
+    <w:bookmarkEnd w:id="79"/>
+    <w:bookmarkStart w:id="80" w:name="X35fe791bde2b24538a71000ea7a80b48c78f998"/>
     <w:p>
       <w:pPr>
         <w:pStyle w:val="BodyText"/>
@@ -2834,8 +2955,8 @@
         <w:t xml:space="preserve">, University of Pennsylvania, February 17.</w:t>
       </w:r>
     </w:p>
-    <w:bookmarkEnd w:id="78"/>
-    <w:bookmarkStart w:id="79" w:name="ref-pca-workshop-zas"/>
+    <w:bookmarkEnd w:id="80"/>
+    <w:bookmarkStart w:id="81" w:name="ref-pca-workshop-zas"/>
     <w:p>
       <w:pPr>
         <w:pStyle w:val="BodyText"/>
@@ -2901,8 +3022,8 @@
         <w:t xml:space="preserve">, Leibniz-Zentrum Allgemeine Sprachwissenschaft, Berlin, December.</w:t>
       </w:r>
     </w:p>
-    <w:bookmarkEnd w:id="79"/>
-    <w:bookmarkStart w:id="81" w:name="ref-topical-pres"/>
+    <w:bookmarkEnd w:id="81"/>
+    <w:bookmarkStart w:id="83" w:name="ref-topical-pres"/>
     <w:p>
       <w:pPr>
         <w:pStyle w:val="BodyText"/>
@@ -2976,7 +3097,7 @@
       <w:r>
         <w:t xml:space="preserve"> </w:t>
       </w:r>
-      <w:hyperlink r:id="rId80">
+      <w:hyperlink r:id="rId82">
         <w:r>
           <w:rPr>
             <w:rStyle w:val="Hyperlink"/>
@@ -2988,8 +3109,8 @@
         <w:t xml:space="preserve">.</w:t>
       </w:r>
     </w:p>
-    <w:bookmarkEnd w:id="81"/>
-    <w:bookmarkStart w:id="83" w:name="ref-pca-workshop-nzilbb"/>
+    <w:bookmarkEnd w:id="83"/>
+    <w:bookmarkStart w:id="85" w:name="ref-pca-workshop-nzilbb"/>
     <w:p>
       <w:pPr>
         <w:pStyle w:val="BodyText"/>
@@ -3060,7 +3181,7 @@
       <w:r>
         <w:t xml:space="preserve"> </w:t>
       </w:r>
-      <w:hyperlink r:id="rId82">
+      <w:hyperlink r:id="rId84">
         <w:r>
           <w:rPr>
             <w:rStyle w:val="Hyperlink"/>
@@ -3072,8 +3193,8 @@
         <w:t xml:space="preserve">.</w:t>
       </w:r>
     </w:p>
-    <w:bookmarkEnd w:id="83"/>
-    <w:bookmarkStart w:id="84" w:name="ref-htk-pres"/>
+    <w:bookmarkEnd w:id="85"/>
+    <w:bookmarkStart w:id="86" w:name="ref-htk-pres"/>
     <w:p>
       <w:pPr>
         <w:pStyle w:val="BodyText"/>
@@ -3181,8 +3302,8 @@
         <w:t xml:space="preserve">, Griffith University, May.</w:t>
       </w:r>
     </w:p>
-    <w:bookmarkEnd w:id="84"/>
-    <w:bookmarkStart w:id="86" w:name="ref-amplitude-pres"/>
+    <w:bookmarkEnd w:id="86"/>
+    <w:bookmarkStart w:id="88" w:name="ref-amplitude-pres"/>
     <w:p>
       <w:pPr>
         <w:pStyle w:val="BodyText"/>
@@ -3277,7 +3398,7 @@
       <w:r>
         <w:t xml:space="preserve"> </w:t>
       </w:r>
-      <w:hyperlink r:id="rId85">
+      <w:hyperlink r:id="rId87">
         <w:r>
           <w:rPr>
             <w:rStyle w:val="Hyperlink"/>
@@ -3289,8 +3410,8 @@
         <w:t xml:space="preserve">.</w:t>
       </w:r>
     </w:p>
-    <w:bookmarkEnd w:id="86"/>
-    <w:bookmarkStart w:id="87" w:name="ref-dha2021"/>
+    <w:bookmarkEnd w:id="88"/>
+    <w:bookmarkStart w:id="89" w:name="ref-dha2021"/>
     <w:p>
       <w:pPr>
         <w:pStyle w:val="BodyText"/>
@@ -3339,8 +3460,8 @@
         <w:t xml:space="preserve">, University of Canterbury, November 23.</w:t>
       </w:r>
     </w:p>
-    <w:bookmarkEnd w:id="87"/>
-    <w:bookmarkStart w:id="88" w:name="Xfde65efb241a072c6d14d0c6c9ce75895d2f8f5"/>
+    <w:bookmarkEnd w:id="89"/>
+    <w:bookmarkStart w:id="90" w:name="Xfde65efb241a072c6d14d0c6c9ce75895d2f8f5"/>
     <w:p>
       <w:pPr>
         <w:pStyle w:val="BodyText"/>
@@ -3398,8 +3519,8 @@
         <w:t xml:space="preserve">, University of Canterbury, September 10.</w:t>
       </w:r>
     </w:p>
-    <w:bookmarkEnd w:id="88"/>
-    <w:bookmarkStart w:id="89" w:name="ref-ucp2020"/>
+    <w:bookmarkEnd w:id="90"/>
+    <w:bookmarkStart w:id="91" w:name="ref-ucp2020"/>
     <w:p>
       <w:pPr>
         <w:pStyle w:val="BodyText"/>
@@ -3436,8 +3557,8 @@
         <w:t xml:space="preserve">, University of Canterbury, October 13.</w:t>
       </w:r>
     </w:p>
-    <w:bookmarkEnd w:id="89"/>
-    <w:bookmarkStart w:id="90" w:name="ref-ucsocio2021-1"/>
+    <w:bookmarkEnd w:id="91"/>
+    <w:bookmarkStart w:id="92" w:name="ref-ucsocio2021-1"/>
     <w:p>
       <w:pPr>
         <w:pStyle w:val="BodyText"/>
@@ -3467,8 +3588,8 @@
         <w:t xml:space="preserve">, University of Canterbury, April 19.</w:t>
       </w:r>
     </w:p>
-    <w:bookmarkEnd w:id="90"/>
-    <w:bookmarkStart w:id="91" w:name="ref-vichy2018"/>
+    <w:bookmarkEnd w:id="92"/>
+    <w:bookmarkStart w:id="93" w:name="ref-vichy2018"/>
     <w:p>
       <w:pPr>
         <w:pStyle w:val="BodyText"/>
@@ -3498,8 +3619,8 @@
         <w:t xml:space="preserve">, Vichy, June 26.</w:t>
       </w:r>
     </w:p>
-    <w:bookmarkEnd w:id="91"/>
-    <w:bookmarkStart w:id="92" w:name="ref-cpc2018"/>
+    <w:bookmarkEnd w:id="93"/>
+    <w:bookmarkStart w:id="94" w:name="ref-cpc2018"/>
     <w:p>
       <w:pPr>
         <w:pStyle w:val="BodyText"/>
@@ -3529,8 +3650,8 @@
         <w:t xml:space="preserve">, St John’s Seminary, Wonersh, January 11.</w:t>
       </w:r>
     </w:p>
-    <w:bookmarkEnd w:id="92"/>
-    <w:bookmarkStart w:id="93" w:name="ref-bshp2017"/>
+    <w:bookmarkEnd w:id="94"/>
+    <w:bookmarkStart w:id="95" w:name="ref-bshp2017"/>
     <w:p>
       <w:pPr>
         <w:pStyle w:val="BodyText"/>
@@ -3560,8 +3681,8 @@
         <w:t xml:space="preserve">, University of Sheffield, April 7.</w:t>
       </w:r>
     </w:p>
-    <w:bookmarkEnd w:id="93"/>
-    <w:bookmarkStart w:id="94" w:name="ref-waikato2016"/>
+    <w:bookmarkEnd w:id="95"/>
+    <w:bookmarkStart w:id="96" w:name="ref-waikato2016"/>
     <w:p>
       <w:pPr>
         <w:pStyle w:val="BodyText"/>
@@ -3591,8 +3712,8 @@
         <w:t xml:space="preserve">, University of Waikato, December 3.</w:t>
       </w:r>
     </w:p>
-    <w:bookmarkEnd w:id="94"/>
-    <w:bookmarkStart w:id="95" w:name="ref-express"/>
+    <w:bookmarkEnd w:id="96"/>
+    <w:bookmarkStart w:id="97" w:name="ref-express"/>
     <w:p>
       <w:pPr>
         <w:pStyle w:val="BodyText"/>
@@ -3622,8 +3743,8 @@
         <w:t xml:space="preserve">, University of Sheffield, August 19.</w:t>
       </w:r>
     </w:p>
-    <w:bookmarkEnd w:id="95"/>
-    <w:bookmarkStart w:id="96" w:name="ref-exacttruth"/>
+    <w:bookmarkEnd w:id="97"/>
+    <w:bookmarkStart w:id="98" w:name="ref-exacttruth"/>
     <w:p>
       <w:pPr>
         <w:pStyle w:val="BodyText"/>
@@ -3653,8 +3774,8 @@
         <w:t xml:space="preserve">, University of Sheffield, June 1.</w:t>
       </w:r>
     </w:p>
-    <w:bookmarkEnd w:id="96"/>
-    <w:bookmarkStart w:id="97" w:name="ref-pragmatistnaturalism"/>
+    <w:bookmarkEnd w:id="98"/>
+    <w:bookmarkStart w:id="99" w:name="ref-pragmatistnaturalism"/>
     <w:p>
       <w:pPr>
         <w:pStyle w:val="BodyText"/>
@@ -3684,8 +3805,8 @@
         <w:t xml:space="preserve">, University of the West of England, Bristol, May 13.</w:t>
       </w:r>
     </w:p>
-    <w:bookmarkEnd w:id="97"/>
-    <w:bookmarkStart w:id="98" w:name="ref-knowhow"/>
+    <w:bookmarkEnd w:id="99"/>
+    <w:bookmarkStart w:id="100" w:name="ref-knowhow"/>
     <w:p>
       <w:pPr>
         <w:pStyle w:val="BodyText"/>
@@ -3715,8 +3836,8 @@
         <w:t xml:space="preserve">, August 13.</w:t>
       </w:r>
     </w:p>
-    <w:bookmarkEnd w:id="98"/>
-    <w:bookmarkStart w:id="99" w:name="ref-quietism2"/>
+    <w:bookmarkEnd w:id="100"/>
+    <w:bookmarkStart w:id="101" w:name="ref-quietism2"/>
     <w:p>
       <w:pPr>
         <w:pStyle w:val="BodyText"/>
@@ -3758,8 +3879,8 @@
         <w:t xml:space="preserve">, University College Dublin, June 9.</w:t>
       </w:r>
     </w:p>
-    <w:bookmarkEnd w:id="99"/>
-    <w:bookmarkStart w:id="100" w:name="ref-quietism1"/>
+    <w:bookmarkEnd w:id="101"/>
+    <w:bookmarkStart w:id="102" w:name="ref-quietism1"/>
     <w:p>
       <w:pPr>
         <w:pStyle w:val="BodyText"/>
@@ -3801,8 +3922,8 @@
         <w:t xml:space="preserve">, University of Hull, May 23.</w:t>
       </w:r>
     </w:p>
-    <w:bookmarkEnd w:id="100"/>
-    <w:bookmarkStart w:id="101" w:name="ref-sellarspeirce"/>
+    <w:bookmarkEnd w:id="102"/>
+    <w:bookmarkStart w:id="103" w:name="ref-sellarspeirce"/>
     <w:p>
       <w:pPr>
         <w:pStyle w:val="BodyText"/>
@@ -3844,8 +3965,8 @@
         <w:t xml:space="preserve">, University of Canterbury, December 4.</w:t>
       </w:r>
     </w:p>
-    <w:bookmarkEnd w:id="101"/>
-    <w:bookmarkStart w:id="102" w:name="ref-price2"/>
+    <w:bookmarkEnd w:id="103"/>
+    <w:bookmarkStart w:id="104" w:name="ref-price2"/>
     <w:p>
       <w:pPr>
         <w:pStyle w:val="BodyText"/>
@@ -3875,8 +3996,8 @@
         <w:t xml:space="preserve">, University of Sheffield, October 15.</w:t>
       </w:r>
     </w:p>
-    <w:bookmarkEnd w:id="102"/>
-    <w:bookmarkStart w:id="103" w:name="ref-habit3"/>
+    <w:bookmarkEnd w:id="104"/>
+    <w:bookmarkStart w:id="105" w:name="ref-habit3"/>
     <w:p>
       <w:pPr>
         <w:pStyle w:val="BodyText"/>
@@ -3918,8 +4039,8 @@
         <w:t xml:space="preserve">international centennial congress, UMass Lowell, July 17.</w:t>
       </w:r>
     </w:p>
-    <w:bookmarkEnd w:id="103"/>
-    <w:bookmarkStart w:id="104" w:name="ref-price1"/>
+    <w:bookmarkEnd w:id="105"/>
+    <w:bookmarkStart w:id="106" w:name="ref-price1"/>
     <w:p>
       <w:pPr>
         <w:pStyle w:val="BodyText"/>
@@ -3949,8 +4070,8 @@
         <w:t xml:space="preserve">, University of Oregon, July 10.</w:t>
       </w:r>
     </w:p>
-    <w:bookmarkEnd w:id="104"/>
-    <w:bookmarkStart w:id="105" w:name="ref-habit2"/>
+    <w:bookmarkEnd w:id="106"/>
+    <w:bookmarkStart w:id="107" w:name="ref-habit2"/>
     <w:p>
       <w:pPr>
         <w:pStyle w:val="BodyText"/>
@@ -3980,8 +4101,8 @@
         <w:t xml:space="preserve">, University of Sheffield, February 12.</w:t>
       </w:r>
     </w:p>
-    <w:bookmarkEnd w:id="105"/>
-    <w:bookmarkStart w:id="106" w:name="ref-cosmology"/>
+    <w:bookmarkEnd w:id="107"/>
+    <w:bookmarkStart w:id="108" w:name="ref-cosmology"/>
     <w:p>
       <w:pPr>
         <w:pStyle w:val="BodyText"/>
@@ -4011,8 +4132,8 @@
         <w:t xml:space="preserve">, University of Sheffield, October 14.</w:t>
       </w:r>
     </w:p>
-    <w:bookmarkEnd w:id="106"/>
-    <w:bookmarkStart w:id="107" w:name="ref-habit1"/>
+    <w:bookmarkEnd w:id="108"/>
+    <w:bookmarkStart w:id="109" w:name="ref-habit1"/>
     <w:p>
       <w:pPr>
         <w:pStyle w:val="BodyText"/>
@@ -4042,8 +4163,8 @@
         <w:t xml:space="preserve">, Victoria University of Wellington, December 6.</w:t>
       </w:r>
     </w:p>
-    <w:bookmarkEnd w:id="107"/>
-    <w:bookmarkStart w:id="108" w:name="ref-formalism"/>
+    <w:bookmarkEnd w:id="109"/>
+    <w:bookmarkStart w:id="110" w:name="ref-formalism"/>
     <w:p>
       <w:pPr>
         <w:pStyle w:val="BodyText"/>
@@ -4073,10 +4194,10 @@
         <w:t xml:space="preserve">, Hokitika, New Zealand.</w:t>
       </w:r>
     </w:p>
-    <w:bookmarkEnd w:id="108"/>
-    <w:bookmarkEnd w:id="109"/>
     <w:bookmarkEnd w:id="110"/>
-    <w:bookmarkStart w:id="116" w:name="other-outputs"/>
+    <w:bookmarkEnd w:id="111"/>
+    <w:bookmarkEnd w:id="112"/>
+    <w:bookmarkStart w:id="118" w:name="other-outputs"/>
     <w:p>
       <w:pPr>
         <w:pStyle w:val="Heading2"/>
@@ -4085,8 +4206,8 @@
         <w:t xml:space="preserve">Other Outputs</w:t>
       </w:r>
     </w:p>
-    <w:bookmarkStart w:id="115" w:name="refs-other"/>
-    <w:bookmarkStart w:id="112" w:name="ref-wilsonblackNZILBBStatsOpen2025"/>
+    <w:bookmarkStart w:id="117" w:name="refs-other"/>
+    <w:bookmarkStart w:id="114" w:name="ref-wilsonblackNZILBBStatsOpen2025"/>
     <w:p>
       <w:pPr>
         <w:pStyle w:val="FirstParagraph"/>
@@ -4186,7 +4307,7 @@
       <w:r>
         <w:t xml:space="preserve">. doi:</w:t>
       </w:r>
-      <w:hyperlink r:id="rId111">
+      <w:hyperlink r:id="rId113">
         <w:r>
           <w:rPr>
             <w:rStyle w:val="Hyperlink"/>
@@ -4198,8 +4319,8 @@
         <w:t xml:space="preserve">.</w:t>
       </w:r>
     </w:p>
-    <w:bookmarkEnd w:id="112"/>
-    <w:bookmarkStart w:id="114" w:name="X17d5ab693d9aed3efc5f87f7e4e8ceb11216226"/>
+    <w:bookmarkEnd w:id="114"/>
+    <w:bookmarkStart w:id="116" w:name="X17d5ab693d9aed3efc5f87f7e4e8ceb11216226"/>
     <w:p>
       <w:pPr>
         <w:pStyle w:val="BodyText"/>
@@ -4247,7 +4368,7 @@
       <w:r>
         <w:t xml:space="preserve">, October. doi:</w:t>
       </w:r>
-      <w:hyperlink r:id="rId113">
+      <w:hyperlink r:id="rId115">
         <w:r>
           <w:rPr>
             <w:rStyle w:val="Hyperlink"/>
@@ -4259,10 +4380,10 @@
         <w:t xml:space="preserve">.</w:t>
       </w:r>
     </w:p>
-    <w:bookmarkEnd w:id="114"/>
-    <w:bookmarkEnd w:id="115"/>
     <w:bookmarkEnd w:id="116"/>
-    <w:bookmarkStart w:id="117" w:name="scholarships-and-awards"/>
+    <w:bookmarkEnd w:id="117"/>
+    <w:bookmarkEnd w:id="118"/>
+    <w:bookmarkStart w:id="119" w:name="scholarships-and-awards"/>
     <w:p>
       <w:pPr>
         <w:pStyle w:val="Heading2"/>
@@ -4335,7 +4456,7 @@
         <w:t xml:space="preserve">2009 | Mathematics Department Summer Research Scholarship | University of Canterbury</w:t>
       </w:r>
     </w:p>
-    <w:bookmarkEnd w:id="117"/>
+    <w:bookmarkEnd w:id="119"/>
     <w:sectPr>
       <w:pgSz w:h="15840" w:w="12240"/>
       <w:pgMar w:bottom="1440" w:footer="720" w:gutter="0" w:header="720" w:left="1440" w:right="1440" w:top="1440"/>

</xml_diff>